<commit_message>
Fix lore violations in Chapter 1 docx (green->silver-blue glow, Earth-Scribe->Mage, E-grade->E Grade, Ancestors->vow)
</commit_message>
<xml_diff>
--- a/Chapter_1_The_Awakening_Revised.docx
+++ b/Chapter_1_The_Awakening_Revised.docx
@@ -652,13 +652,13 @@
         <w:jc w:val="left"/>
       </w:pPr>
       <w:r>
-        <w:t xml:space="preserve">Names were called. One by one, teenagers stepped up onto the platform. I watched a boy from the lower district step into the ring; the runes flared, casting a faint green glow over his face. Evaluators at the edge of the stage scribbled noted into massive ledgers, calling out his rank: </w:t>
+        <w:t xml:space="preserve">Names were called. One by one, teenagers stepped up onto the platform. I watched a boy from the lower district step into the ring; the runes flared, casting a faint silver-blue glow over his face. Evaluators at the edge of the stage scribbled notes into massive ledgers, calling out his rank: </w:t>
       </w:r>
       <w:r>
         <w:rPr>
           <w:i/>
         </w:rPr>
-        <w:t>E-Grade Earth-Scribe.</w:t>
+        <w:t>E Grade, Mage.</w:t>
       </w:r>
     </w:p>
     <w:p>
@@ -747,7 +747,7 @@
         <w:jc w:val="left"/>
       </w:pPr>
       <w:r>
-        <w:t>It kept rising. The air tasted like ozone and static. For five suffocating seconds, a fifteen-year-old girl lit up the entire hall like a fallen star. It wasn't the light of an E-grade. It wasn't even the light of an A-grade.</w:t>
+        <w:t>It kept rising. The air tasted like ozone and static. For five suffocating seconds, a fifteen-year-old girl lit up the entire hall like a fallen star. It wasn't the light of an E Grade. It wasn't even the light of an A Grade.</w:t>
       </w:r>
     </w:p>
     <w:p>
@@ -757,7 +757,7 @@
         <w:jc w:val="left"/>
       </w:pPr>
       <w:r>
-        <w:t>"By the Ancestors," a priest near the front whispered, stumbling backward. "That's impossible..."</w:t>
+        <w:t>"By the vow," a priest near the front whispered, stumbling backward. "That's impossible..."</w:t>
       </w:r>
     </w:p>
     <w:p>

</xml_diff>

<commit_message>
Apply altar note to Chapter 1: altar reads (not evaluators), feels-like-hours sensation, anomalous-signature detection for Bella
</commit_message>
<xml_diff>
--- a/Chapter_1_The_Awakening_Revised.docx
+++ b/Chapter_1_The_Awakening_Revised.docx
@@ -652,13 +652,12 @@
         <w:jc w:val="left"/>
       </w:pPr>
       <w:r>
-        <w:t xml:space="preserve">Names were called. One by one, teenagers stepped up onto the platform. I watched a boy from the lower district step into the ring; the runes flared, casting a faint silver-blue glow over his face. Evaluators at the edge of the stage scribbled notes into massive ledgers, calling out his rank: </w:t>
+        <w:t>Names were called. One by one, teenagers stepped up onto the platform. I watched a boy from the lower district step into the ring; the runes flared, casting a faint silver-blue glow over his face, and for a few seconds he stood rigid, eyes gone somewhere the rest of us couldn’t follow — the few seconds every awakened soul swears feel like hours. Evaluators at the edge of the stage scribbled notes into massive ledgers, recording the reading the altar had already shown: E Grade, Mage.</w:t>
       </w:r>
       <w:r>
         <w:rPr>
           <w:i/>
         </w:rPr>
-        <w:t>E Grade, Mage.</w:t>
       </w:r>
     </w:p>
     <w:p>
@@ -747,7 +746,7 @@
         <w:jc w:val="left"/>
       </w:pPr>
       <w:r>
-        <w:t>It kept rising. The air tasted like ozone and static. For five suffocating seconds, a fifteen-year-old girl lit up the entire hall like a fallen star. It wasn't the light of an E Grade. It wasn't even the light of an A Grade.</w:t>
+        <w:t>It kept rising. The air tasted like ozone and static. For five suffocating seconds — though Bella would later swear it was an hour — a fifteen-year-old girl lit up the entire hall like a fallen star. It wasn't the light of an E Grade. It wasn't even the light of an A Grade. And deep in the floor of the dais, a rune no one had seen glow in a hundred years flared to life: the mark of an anomalous signature, the reading the Academy Altar had been built to catch.</w:t>
       </w:r>
     </w:p>
     <w:p>

</xml_diff>

<commit_message>
Update Chapters 1-2 to new vow lore: Thalor Elwin (Fifth Pillar) is the Guardian at the altar, Bella's halo forms during her reading
</commit_message>
<xml_diff>
--- a/Chapter_1_The_Awakening_Revised.docx
+++ b/Chapter_1_The_Awakening_Revised.docx
@@ -642,7 +642,7 @@
         <w:jc w:val="left"/>
       </w:pPr>
       <w:r>
-        <w:t>At the center of the room sat a massive, raised dais inlaid with a ring of silver runes. They pulsed with a pale, rhythmic light, humming low enough to make my teeth ache.</w:t>
+        <w:t>At the center of the room sat a massive, raised dais inlaid with a ring of silver runes. They pulsed with a pale, rhythmic light, humming low enough to make my teeth ache. And at the dais’s edge stood the Guardian — Thalor Elwin, the Fifth Pillar, the angel who spoke every vow and shaped every halo in the world. I’d heard his name my whole life. I’d never once seen his face. The hall had gone quiet around him without anyone telling it to, the way a room goes quiet when something vast is standing in it.</w:t>
       </w:r>
     </w:p>
     <w:p>
@@ -746,7 +746,7 @@
         <w:jc w:val="left"/>
       </w:pPr>
       <w:r>
-        <w:t>It kept rising. The air tasted like ozone and static. For five suffocating seconds — though Bella would later swear it was an hour — a fifteen-year-old girl lit up the entire hall like a fallen star. It wasn't the light of an E Grade. It wasn't even the light of an A Grade. And deep in the floor of the dais, a rune no one had seen glow in a hundred years flared to life: the mark of an anomalous signature, the reading the Academy Altar had been built to catch.</w:t>
+        <w:t>It kept rising. The air tasted like ozone and static. Above her head, where every angel's halo forms, a ring of gold blazed into being — and it did not stop at soft and holy. It burned. Bright enough to hurt to look at. For five suffocating seconds — though Bella would later swear it was an hour — a fifteen-year-old girl lit up the entire hall like a fallen star. It wasn't the light of an E Grade. It wasn't even the light of an A Grade. And deep in the floor of the dais, a rune no one had seen glow in a hundred years flared to life: the mark of an anomalous signature, the reading the Academy Altar had been built to catch.</w:t>
       </w:r>
     </w:p>
     <w:p>

</xml_diff>

<commit_message>
Apply proper thought formatting: italics without 'I thought' tags, split recalled-dialogue attribution into roman, no quote-in-italic double-marking
</commit_message>
<xml_diff>
--- a/Chapter_1_The_Awakening_Revised.docx
+++ b/Chapter_1_The_Awakening_Revised.docx
@@ -200,7 +200,7 @@
         <w:rPr>
           <w:i/>
         </w:rPr>
-        <w:t>"Why do I have to keep it on?"</w:t>
+        <w:t>Why do I have to keep it on?</w:t>
       </w:r>
     </w:p>
     <w:p>
@@ -213,7 +213,19 @@
         <w:rPr>
           <w:i/>
         </w:rPr>
-        <w:t>"Because it keeps you safe, she’d told me, her eyes dead serious. And because you gave me your word."</w:t>
+        <w:t xml:space="preserve">Because it keeps you safe, </w:t>
+      </w:r>
+      <w:r>
+        <w:rPr>
+          <w:i w:val="0"/>
+        </w:rPr>
+        <w:t xml:space="preserve">she’d told me, her eyes dead serious. </w:t>
+      </w:r>
+      <w:r>
+        <w:rPr>
+          <w:i/>
+        </w:rPr>
+        <w:t>And because you gave me your word.</w:t>
       </w:r>
     </w:p>
     <w:p>
@@ -224,12 +236,9 @@
       </w:pPr>
       <w:r>
         <w:rPr>
-          <w:i/>
+          <w:i w:val="0"/>
         </w:rPr>
-        <w:t>Pretty sure I hadn't given anyone my word at six years old,</w:t>
-      </w:r>
-      <w:r>
-        <w:t xml:space="preserve"> I thought, but I’d kept the promise anyway. I curled my fingers around the cold stone through my shirt, letting it anchor me.</w:t>
+        <w:t>Pretty sure I hadn't given anyone my word at six years old, but I’d kept the promise anyway. I curled my fingers around the cold stone through my shirt, letting it anchor me.</w:t>
       </w:r>
     </w:p>
     <w:p>
@@ -292,7 +301,7 @@
         <w:rPr>
           <w:i/>
         </w:rPr>
-        <w:t>"Why do you always look at me like I’m about to fall?"</w:t>
+        <w:t>Why do you always look at me like I’m about to fall?</w:t>
       </w:r>
     </w:p>
     <w:p>
@@ -305,7 +314,19 @@
         <w:rPr>
           <w:i/>
         </w:rPr>
-        <w:t>"Because you're the only thing in this world that's mine, she’d said softly. And I intend to keep you in one piece."</w:t>
+        <w:t xml:space="preserve">Because you’re the only thing in this world that’s mine, </w:t>
+      </w:r>
+      <w:r>
+        <w:rPr>
+          <w:i w:val="0"/>
+        </w:rPr>
+        <w:t xml:space="preserve">she’d said softly. </w:t>
+      </w:r>
+      <w:r>
+        <w:rPr>
+          <w:i/>
+        </w:rPr>
+        <w:t>And I intend to keep you in one piece.</w:t>
       </w:r>
     </w:p>
     <w:p>
@@ -395,7 +416,7 @@
       </w:pPr>
       <w:r>
         <w:rPr>
-          <w:i/>
+          <w:i w:val="0"/>
         </w:rPr>
         <w:t>I’d never told Sofia. How do you casually bring up, "Hey, so fun news, I think there's a parasite riding shotgun in my torso?" You don't. You keep your mouth shut.</w:t>
       </w:r>

</xml_diff>

<commit_message>
Move Vow ritual into Chapter 1 (Thalor officiates Bella's vow at the altar); remove it from Chapter 3 plan
</commit_message>
<xml_diff>
--- a/Chapter_1_The_Awakening_Revised.docx
+++ b/Chapter_1_The_Awakening_Revised.docx
@@ -718,17 +718,14 @@
         <w:jc w:val="left"/>
       </w:pPr>
       <w:r>
-        <w:t xml:space="preserve">Bella squeezed my forearm hard. </w:t>
+        <w:t>Bella squeezed my forearm hard. Told you so, her eyes said. She marched up the steps, chin high, and stepped squarely into the center of the ring. Thalor Elwin moved first. The Guardian stepped forward to the edge of the ring, and when he spoke, his voice was quiet and it carried to the back of the hall, the way a promise does. “Repeat after me.” And Bella did. I heard the words, the same words every angel speaks on this one day, and for a second they felt almost ordinary — With this light I make my promise... Then the altar answered.</w:t>
       </w:r>
       <w:r>
         <w:rPr>
           <w:i/>
         </w:rPr>
-        <w:t>Told you so,</w:t>
       </w:r>
-      <w:r>
-        <w:t xml:space="preserve"> her eyes said. She marched up the steps, chin high, and stepped squarely into the center of the ring.</w:t>
-      </w:r>
+      <w:r/>
     </w:p>
     <w:p>
       <w:pPr>
@@ -767,7 +764,7 @@
         <w:jc w:val="left"/>
       </w:pPr>
       <w:r>
-        <w:t>It kept rising. The air tasted like ozone and static. Above her head, where every angel's halo forms, a ring of gold blazed into being — and it did not stop at soft and holy. It burned. Bright enough to hurt to look at. For five suffocating seconds — though Bella would later swear it was an hour — a fifteen-year-old girl lit up the entire hall like a fallen star. It wasn't the light of an E Grade. It wasn't even the light of an A Grade. And deep in the floor of the dais, a rune no one had seen glow in a hundred years flared to life: the mark of an anomalous signature, the reading the Academy Altar had been built to catch.</w:t>
+        <w:t>It kept rising. The air tasted like ozone and static. Above her head, where every angel's halo forms, a ring of gold blazed into being — the promise made visible, her own word sealing itself into light — and it did not stop at soft and holy. It burned. Bright enough to hurt to look at. For five suffocating seconds — though Bella would later swear it was an hour — a fifteen-year-old girl lit up the entire hall like a fallen star. It wasn't the light of an E Grade. It wasn't even the light of an A Grade. And deep in the floor of the dais, a rune no one had seen glow in a hundred years flared to life: the mark of an anomalous signature, the reading the Academy Altar had been built to catch.</w:t>
       </w:r>
     </w:p>
     <w:p>

</xml_diff>

<commit_message>
Introvert pass on Chapters 1-2 (self-conscious beats, aversion to being watched); Chapter 3 md draft
</commit_message>
<xml_diff>
--- a/Chapter_1_The_Awakening_Revised.docx
+++ b/Chapter_1_The_Awakening_Revised.docx
@@ -118,7 +118,7 @@
         <w:jc w:val="left"/>
       </w:pPr>
       <w:r>
-        <w:t>I sat up so fast the room spun. "I'm up! Look! Fully vertical."</w:t>
+        <w:t>I sat up so fast the room spun. "I'm up! Look! Fully vertical." It sounded better in my head.</w:t>
       </w:r>
     </w:p>
     <w:p>
@@ -494,7 +494,7 @@
         <w:jc w:val="left"/>
       </w:pPr>
       <w:r>
-        <w:t>"Bella. Relax." I let her drag me. "I'm awake. I'm moving. I'm currently being abducted down my own street. What more do you want?"</w:t>
+        <w:t>"Bella. Relax." I let her drag me. "I'm awake. I'm moving. I'm currently being abducted down my own street. What more do you want?" It came out lighter than I meant, because it was Bella, and Bella was the one person I didn't have to be careful around.</w:t>
       </w:r>
     </w:p>
     <w:p>

</xml_diff>

<commit_message>
Adopt user's Chapter 3 draft; replace 'second heartbeat' with pressure-behind-seal motif across ch1-3; generate Chapter 3 docx
</commit_message>
<xml_diff>
--- a/Chapter_1_The_Awakening_Revised.docx
+++ b/Chapter_1_The_Awakening_Revised.docx
@@ -395,7 +395,7 @@
         <w:jc w:val="left"/>
       </w:pPr>
       <w:r>
-        <w:t>Sometimes—when the house was dead silent, when I laid still for too long—I felt a pulse in there. A second heartbeat. Out of step with my own. Wrong.</w:t>
+        <w:t>Sometimes—when the house was dead silent, when I laid still for too long—I felt a pulse in there. Not a heartbeat. Something else. Out of step with me. Wrong.</w:t>
       </w:r>
     </w:p>
     <w:p>
@@ -794,7 +794,7 @@
         <w:jc w:val="left"/>
       </w:pPr>
       <w:r>
-        <w:t>And beneath my ribs, the secondary pulse slammed against my chest wall—hard, sharp, and violently out of rhythm. The thing inside me was waking up.</w:t>
+        <w:t>And beneath my ribs, the pressure slammed against my chest—hard, sharp, and sudden. The thing inside me was waking up.</w:t>
       </w:r>
     </w:p>
     <w:p>

</xml_diff>